<commit_message>
Se arreglo centrado de universidades
</commit_message>
<xml_diff>
--- a/public/documentos/declaracion-jurada-2019.docx
+++ b/public/documentos/declaracion-jurada-2019.docx
@@ -1,6 +1,6 @@
 
 <file path=word/document.xml><?xml version="1.0" encoding="utf-8"?>
-<w:document xmlns:wpc="http://schemas.microsoft.com/office/word/2010/wordprocessingCanvas" xmlns:mc="http://schemas.openxmlformats.org/markup-compatibility/2006" xmlns:o="urn:schemas-microsoft-com:office:office" xmlns:r="http://schemas.openxmlformats.org/officeDocument/2006/relationships" xmlns:m="http://schemas.openxmlformats.org/officeDocument/2006/math" xmlns:v="urn:schemas-microsoft-com:vml" xmlns:wp14="http://schemas.microsoft.com/office/word/2010/wordprocessingDrawing" xmlns:wp="http://schemas.openxmlformats.org/drawingml/2006/wordprocessingDrawing" xmlns:w10="urn:schemas-microsoft-com:office:word" xmlns:w="http://schemas.openxmlformats.org/wordprocessingml/2006/main" xmlns:w14="http://schemas.microsoft.com/office/word/2010/wordml" xmlns:w15="http://schemas.microsoft.com/office/word/2012/wordml" xmlns:wpg="http://schemas.microsoft.com/office/word/2010/wordprocessingGroup" xmlns:wpi="http://schemas.microsoft.com/office/word/2010/wordprocessingInk" xmlns:wne="http://schemas.microsoft.com/office/word/2006/wordml" xmlns:wps="http://schemas.microsoft.com/office/word/2010/wordprocessingShape" mc:Ignorable="w14 w15 wp14">
+<w:document xmlns:wpc="http://schemas.microsoft.com/office/word/2010/wordprocessingCanvas" xmlns:cx="http://schemas.microsoft.com/office/drawing/2014/chartex" xmlns:cx1="http://schemas.microsoft.com/office/drawing/2015/9/8/chartex" xmlns:cx2="http://schemas.microsoft.com/office/drawing/2015/10/21/chartex" xmlns:cx3="http://schemas.microsoft.com/office/drawing/2016/5/9/chartex" xmlns:cx4="http://schemas.microsoft.com/office/drawing/2016/5/10/chartex" xmlns:cx5="http://schemas.microsoft.com/office/drawing/2016/5/11/chartex" xmlns:cx6="http://schemas.microsoft.com/office/drawing/2016/5/12/chartex" xmlns:cx7="http://schemas.microsoft.com/office/drawing/2016/5/13/chartex" xmlns:cx8="http://schemas.microsoft.com/office/drawing/2016/5/14/chartex" xmlns:mc="http://schemas.openxmlformats.org/markup-compatibility/2006" xmlns:aink="http://schemas.microsoft.com/office/drawing/2016/ink" xmlns:am3d="http://schemas.microsoft.com/office/drawing/2017/model3d" xmlns:o="urn:schemas-microsoft-com:office:office" xmlns:r="http://schemas.openxmlformats.org/officeDocument/2006/relationships" xmlns:m="http://schemas.openxmlformats.org/officeDocument/2006/math" xmlns:v="urn:schemas-microsoft-com:vml" xmlns:wp14="http://schemas.microsoft.com/office/word/2010/wordprocessingDrawing" xmlns:wp="http://schemas.openxmlformats.org/drawingml/2006/wordprocessingDrawing" xmlns:w10="urn:schemas-microsoft-com:office:word" xmlns:w="http://schemas.openxmlformats.org/wordprocessingml/2006/main" xmlns:w14="http://schemas.microsoft.com/office/word/2010/wordml" xmlns:w15="http://schemas.microsoft.com/office/word/2012/wordml" xmlns:w16cex="http://schemas.microsoft.com/office/word/2018/wordml/cex" xmlns:w16cid="http://schemas.microsoft.com/office/word/2016/wordml/cid" xmlns:w16="http://schemas.microsoft.com/office/word/2018/wordml" xmlns:w16sdtdh="http://schemas.microsoft.com/office/word/2020/wordml/sdtdatahash" xmlns:w16se="http://schemas.microsoft.com/office/word/2015/wordml/symex" xmlns:wpg="http://schemas.microsoft.com/office/word/2010/wordprocessingGroup" xmlns:wpi="http://schemas.microsoft.com/office/word/2010/wordprocessingInk" xmlns:wne="http://schemas.microsoft.com/office/word/2006/wordml" xmlns:wps="http://schemas.microsoft.com/office/word/2010/wordprocessingShape" mc:Ignorable="w14 w15 w16se w16cid w16 w16cex w16sdtdh wp14">
   <w:body>
     <w:tbl>
       <w:tblPr>
@@ -41,11 +41,9 @@
             <w:pPr>
               <w:widowControl w:val="0"/>
               <w:tabs>
-                <w:tab w:val="center" w:pos="4419"/>
-                <w:tab w:val="right" w:pos="8838"/>
+                <w:tab w:val="center" w:pos="1028"/>
               </w:tabs>
               <w:suppressAutoHyphens/>
-              <w:ind w:left="538"/>
               <w:rPr>
                 <w:rFonts w:ascii="Calibri" w:eastAsia="Calibri" w:hAnsi="Calibri" w:cs="Times New Roman"/>
                 <w:lang w:val="es-ES_tradnl"/>
@@ -55,35 +53,21 @@
               <w:rPr>
                 <w:rFonts w:ascii="Calibri" w:eastAsia="Calibri" w:hAnsi="Calibri" w:cs="Times New Roman"/>
                 <w:noProof/>
-                <w:lang w:eastAsia="es-PE"/>
+                <w:lang w:val="es-ES_tradnl"/>
               </w:rPr>
               <w:drawing>
-                <wp:anchor distT="0" distB="0" distL="114300" distR="114300" simplePos="0" relativeHeight="251664384" behindDoc="1" locked="0" layoutInCell="1" allowOverlap="1" wp14:anchorId="622EC792" wp14:editId="37AB27AC">
+                <wp:anchor distT="0" distB="0" distL="114300" distR="114300" simplePos="0" relativeHeight="251657216" behindDoc="0" locked="0" layoutInCell="1" allowOverlap="1" wp14:anchorId="40447762" wp14:editId="01F716FA">
                   <wp:simplePos x="0" y="0"/>
                   <wp:positionH relativeFrom="column">
-                    <wp:posOffset>260985</wp:posOffset>
+                    <wp:posOffset>288925</wp:posOffset>
                   </wp:positionH>
                   <wp:positionV relativeFrom="paragraph">
-                    <wp:posOffset>69215</wp:posOffset>
+                    <wp:posOffset>82550</wp:posOffset>
                   </wp:positionV>
-                  <wp:extent cx="809625" cy="809625"/>
-                  <wp:effectExtent l="0" t="0" r="9525" b="9525"/>
-                  <wp:wrapThrough wrapText="bothSides">
-                    <wp:wrapPolygon edited="0">
-                      <wp:start x="6099" y="0"/>
-                      <wp:lineTo x="0" y="3558"/>
-                      <wp:lineTo x="0" y="16772"/>
-                      <wp:lineTo x="5591" y="21346"/>
-                      <wp:lineTo x="6099" y="21346"/>
-                      <wp:lineTo x="15247" y="21346"/>
-                      <wp:lineTo x="15755" y="21346"/>
-                      <wp:lineTo x="21346" y="16772"/>
-                      <wp:lineTo x="21346" y="3558"/>
-                      <wp:lineTo x="15247" y="0"/>
-                      <wp:lineTo x="6099" y="0"/>
-                    </wp:wrapPolygon>
-                  </wp:wrapThrough>
-                  <wp:docPr id="9" name="Imagen 9" descr="C:\Users\USUARIO\Desktop\logo bruning.png"/>
+                  <wp:extent cx="742950" cy="833120"/>
+                  <wp:effectExtent l="0" t="0" r="0" b="5080"/>
+                  <wp:wrapNone/>
+                  <wp:docPr id="6" name="Imagen 6" descr="Descripción: C:\Users\MARIEL\Downloads\logo blanco (1).jpg"/>
                   <wp:cNvGraphicFramePr>
                     <a:graphicFrameLocks xmlns:a="http://schemas.openxmlformats.org/drawingml/2006/main" noChangeAspect="1"/>
                   </wp:cNvGraphicFramePr>
@@ -91,13 +75,13 @@
                     <a:graphicData uri="http://schemas.openxmlformats.org/drawingml/2006/picture">
                       <pic:pic xmlns:pic="http://schemas.openxmlformats.org/drawingml/2006/picture">
                         <pic:nvPicPr>
-                          <pic:cNvPr id="0" name="Picture 1" descr="C:\Users\USUARIO\Desktop\logo bruning.png"/>
+                          <pic:cNvPr id="0" name="Imagen 21" descr="Descripción: C:\Users\MARIEL\Downloads\logo blanco (1).jpg"/>
                           <pic:cNvPicPr>
                             <a:picLocks noChangeAspect="1" noChangeArrowheads="1"/>
                           </pic:cNvPicPr>
                         </pic:nvPicPr>
                         <pic:blipFill>
-                          <a:blip r:embed="rId4" cstate="print">
+                          <a:blip r:embed="rId4">
                             <a:extLst>
                               <a:ext uri="{28A0092B-C50C-407E-A947-70E740481C1C}">
                                 <a14:useLocalDpi xmlns:a14="http://schemas.microsoft.com/office/drawing/2010/main" val="0"/>
@@ -112,7 +96,7 @@
                         <pic:spPr bwMode="auto">
                           <a:xfrm>
                             <a:off x="0" y="0"/>
-                            <a:ext cx="809625" cy="809625"/>
+                            <a:ext cx="742950" cy="833120"/>
                           </a:xfrm>
                           <a:prstGeom prst="rect">
                             <a:avLst/>
@@ -167,7 +151,7 @@
                 <w:sz w:val="28"/>
                 <w:lang w:eastAsia="es-PE"/>
               </w:rPr>
-              <w:t>DECLARACIÓN  JURADA</w:t>
+              <w:t>DECLARACIÓN JURADA</w:t>
             </w:r>
           </w:p>
         </w:tc>
@@ -295,7 +279,14 @@
                 <w:rFonts w:eastAsiaTheme="minorEastAsia"/>
                 <w:lang w:eastAsia="es-PE"/>
               </w:rPr>
-              <w:t xml:space="preserve">HHB - GTH - </w:t>
+              <w:t>BS</w:t>
+            </w:r>
+            <w:r>
+              <w:rPr>
+                <w:rFonts w:eastAsiaTheme="minorEastAsia"/>
+                <w:lang w:eastAsia="es-PE"/>
+              </w:rPr>
+              <w:t xml:space="preserve"> - GTH - </w:t>
             </w:r>
             <w:r>
               <w:rPr>
@@ -638,16 +629,14 @@
         </w:rPr>
         <w:t>, ______</w:t>
       </w:r>
-      <w:proofErr w:type="gramStart"/>
-      <w:r>
-        <w:rPr>
-          <w:rFonts w:cstheme="minorHAnsi"/>
-          <w:sz w:val="26"/>
-          <w:szCs w:val="26"/>
-        </w:rPr>
-        <w:t>_ ,</w:t>
-      </w:r>
-      <w:proofErr w:type="gramEnd"/>
+      <w:r>
+        <w:rPr>
+          <w:rFonts w:cstheme="minorHAnsi"/>
+          <w:sz w:val="26"/>
+          <w:szCs w:val="26"/>
+        </w:rPr>
+        <w:t>_,</w:t>
+      </w:r>
       <w:r>
         <w:rPr>
           <w:rFonts w:cstheme="minorHAnsi"/>
@@ -670,7 +659,23 @@
           <w:sz w:val="26"/>
           <w:szCs w:val="26"/>
         </w:rPr>
-        <w:t>______________ del 201___</w:t>
+        <w:t>______________ del 20</w:t>
+      </w:r>
+      <w:r>
+        <w:rPr>
+          <w:rFonts w:cstheme="minorHAnsi"/>
+          <w:sz w:val="26"/>
+          <w:szCs w:val="26"/>
+        </w:rPr>
+        <w:t>2</w:t>
+      </w:r>
+      <w:r>
+        <w:rPr>
+          <w:rFonts w:cstheme="minorHAnsi"/>
+          <w:sz w:val="26"/>
+          <w:szCs w:val="26"/>
+        </w:rPr>
+        <w:t>___</w:t>
       </w:r>
     </w:p>
     <w:p>
@@ -703,7 +708,7 @@
         <mc:AlternateContent>
           <mc:Choice Requires="wps">
             <w:drawing>
-              <wp:anchor distT="0" distB="0" distL="114300" distR="114300" simplePos="0" relativeHeight="251660288" behindDoc="0" locked="0" layoutInCell="1" allowOverlap="1" wp14:anchorId="2B9F678C" wp14:editId="1D542F37">
+              <wp:anchor distT="0" distB="0" distL="114300" distR="114300" simplePos="0" relativeHeight="251660288" behindDoc="0" locked="0" layoutInCell="1" allowOverlap="1" wp14:anchorId="77DE23BB" wp14:editId="200DAD1B">
                 <wp:simplePos x="0" y="0"/>
                 <wp:positionH relativeFrom="column">
                   <wp:posOffset>4327888</wp:posOffset>
@@ -789,7 +794,7 @@
           </mc:Choice>
           <mc:Fallback>
             <w:pict>
-              <v:shapetype w14:anchorId="2B9F678C" id="_x0000_t202" coordsize="21600,21600" o:spt="202" path="m,l,21600r21600,l21600,xe">
+              <v:shapetype w14:anchorId="77DE23BB" id="_x0000_t202" coordsize="21600,21600" o:spt="202" path="m,l,21600r21600,l21600,xe">
                 <v:stroke joinstyle="miter"/>
                 <v:path gradientshapeok="t" o:connecttype="rect"/>
               </v:shapetype>
@@ -827,7 +832,7 @@
         <mc:AlternateContent>
           <mc:Choice Requires="wps">
             <w:drawing>
-              <wp:anchor distT="0" distB="0" distL="114300" distR="114300" simplePos="0" relativeHeight="251662336" behindDoc="0" locked="0" layoutInCell="1" allowOverlap="1" wp14:anchorId="41A42427" wp14:editId="510BB778">
+              <wp:anchor distT="0" distB="0" distL="114300" distR="114300" simplePos="0" relativeHeight="251662336" behindDoc="0" locked="0" layoutInCell="1" allowOverlap="1" wp14:anchorId="47B69523" wp14:editId="42843FA0">
                 <wp:simplePos x="0" y="0"/>
                 <wp:positionH relativeFrom="column">
                   <wp:posOffset>3091815</wp:posOffset>
@@ -903,7 +908,7 @@
           </mc:Choice>
           <mc:Fallback>
             <w:pict>
-              <v:shape w14:anchorId="41A42427" id="4 Cuadro de texto" o:spid="_x0000_s1027" type="#_x0000_t202" style="position:absolute;left:0;text-align:left;margin-left:243.45pt;margin-top:64.65pt;width:55.5pt;height:22.5pt;z-index:251662336;visibility:visible;mso-wrap-style:square;mso-width-percent:0;mso-height-percent:0;mso-wrap-distance-left:9pt;mso-wrap-distance-top:0;mso-wrap-distance-right:9pt;mso-wrap-distance-bottom:0;mso-position-horizontal:absolute;mso-position-horizontal-relative:text;mso-position-vertical:absolute;mso-position-vertical-relative:text;mso-width-percent:0;mso-height-percent:0;mso-width-relative:margin;mso-height-relative:margin;v-text-anchor:top" o:gfxdata="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" fillcolor="white [3201]" stroked="f" strokeweight=".5pt">
+              <v:shape w14:anchorId="47B69523" id="4 Cuadro de texto" o:spid="_x0000_s1027" type="#_x0000_t202" style="position:absolute;left:0;text-align:left;margin-left:243.45pt;margin-top:64.65pt;width:55.5pt;height:22.5pt;z-index:251662336;visibility:visible;mso-wrap-style:square;mso-width-percent:0;mso-height-percent:0;mso-wrap-distance-left:9pt;mso-wrap-distance-top:0;mso-wrap-distance-right:9pt;mso-wrap-distance-bottom:0;mso-position-horizontal:absolute;mso-position-horizontal-relative:text;mso-position-vertical:absolute;mso-position-vertical-relative:text;mso-width-percent:0;mso-height-percent:0;mso-width-relative:margin;mso-height-relative:margin;v-text-anchor:top" o:gfxdata="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" fillcolor="white [3201]" stroked="f" strokeweight=".5pt">
                 <v:textbox>
                   <w:txbxContent>
                     <w:p>
@@ -929,7 +934,7 @@
         <mc:AlternateContent>
           <mc:Choice Requires="wps">
             <w:drawing>
-              <wp:anchor distT="0" distB="0" distL="114300" distR="114300" simplePos="0" relativeHeight="251661312" behindDoc="0" locked="0" layoutInCell="1" allowOverlap="1" wp14:anchorId="498A657D" wp14:editId="5D643FA7">
+              <wp:anchor distT="0" distB="0" distL="114300" distR="114300" simplePos="0" relativeHeight="251661312" behindDoc="0" locked="0" layoutInCell="1" allowOverlap="1" wp14:anchorId="6689A3C8" wp14:editId="495D1482">
                 <wp:simplePos x="0" y="0"/>
                 <wp:positionH relativeFrom="column">
                   <wp:posOffset>2481580</wp:posOffset>
@@ -983,7 +988,7 @@
           </mc:Choice>
           <mc:Fallback>
             <w:pict>
-              <v:line w14:anchorId="01F63C8B" id="3 Conector recto" o:spid="_x0000_s1026" style="position:absolute;z-index:251661312;visibility:visible;mso-wrap-style:square;mso-wrap-distance-left:9pt;mso-wrap-distance-top:0;mso-wrap-distance-right:9pt;mso-wrap-distance-bottom:0;mso-position-horizontal:absolute;mso-position-horizontal-relative:text;mso-position-vertical:absolute;mso-position-vertical-relative:text" from="195.4pt,59.9pt" to="334.15pt,59.9pt" o:gfxdata="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" strokecolor="black [3213]" strokeweight="1.5pt"/>
+              <v:line w14:anchorId="24DE6F29" id="3 Conector recto" o:spid="_x0000_s1026" style="position:absolute;z-index:251661312;visibility:visible;mso-wrap-style:square;mso-wrap-distance-left:9pt;mso-wrap-distance-top:0;mso-wrap-distance-right:9pt;mso-wrap-distance-bottom:0;mso-position-horizontal:absolute;mso-position-horizontal-relative:text;mso-position-vertical:absolute;mso-position-vertical-relative:text" from="195.4pt,59.9pt" to="334.15pt,59.9pt" o:gfxdata="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" strokecolor="black [3213]" strokeweight="1.5pt"/>
             </w:pict>
           </mc:Fallback>
         </mc:AlternateContent>
@@ -998,8 +1003,6 @@
           <w:szCs w:val="26"/>
         </w:rPr>
       </w:pPr>
-      <w:bookmarkStart w:id="0" w:name="_GoBack"/>
-      <w:bookmarkEnd w:id="0"/>
       <w:r>
         <w:rPr>
           <w:rFonts w:cstheme="minorHAnsi"/>
@@ -1011,7 +1014,7 @@
         <mc:AlternateContent>
           <mc:Choice Requires="wps">
             <w:drawing>
-              <wp:anchor distT="0" distB="0" distL="114300" distR="114300" simplePos="0" relativeHeight="251659264" behindDoc="0" locked="0" layoutInCell="1" allowOverlap="1" wp14:anchorId="62D26DB8" wp14:editId="3DC81E8F">
+              <wp:anchor distT="0" distB="0" distL="114300" distR="114300" simplePos="0" relativeHeight="251659264" behindDoc="0" locked="0" layoutInCell="1" allowOverlap="1" wp14:anchorId="12E8ABCD" wp14:editId="03139285">
                 <wp:simplePos x="0" y="0"/>
                 <wp:positionH relativeFrom="column">
                   <wp:posOffset>2577465</wp:posOffset>
@@ -1084,7 +1087,7 @@
           </mc:Choice>
           <mc:Fallback>
             <w:pict>
-              <v:shape w14:anchorId="62D26DB8" id="1 Cuadro de texto" o:spid="_x0000_s1028" type="#_x0000_t202" style="position:absolute;left:0;text-align:left;margin-left:202.95pt;margin-top:52.55pt;width:138.75pt;height:21.75pt;z-index:251659264;visibility:visible;mso-wrap-style:square;mso-wrap-distance-left:9pt;mso-wrap-distance-top:0;mso-wrap-distance-right:9pt;mso-wrap-distance-bottom:0;mso-position-horizontal:absolute;mso-position-horizontal-relative:text;mso-position-vertical:absolute;mso-position-vertical-relative:text;v-text-anchor:top" o:gfxdata="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" fillcolor="white [3201]" stroked="f" strokeweight=".5pt">
+              <v:shape w14:anchorId="12E8ABCD" id="1 Cuadro de texto" o:spid="_x0000_s1028" type="#_x0000_t202" style="position:absolute;left:0;text-align:left;margin-left:202.95pt;margin-top:52.55pt;width:138.75pt;height:21.75pt;z-index:251659264;visibility:visible;mso-wrap-style:square;mso-wrap-distance-left:9pt;mso-wrap-distance-top:0;mso-wrap-distance-right:9pt;mso-wrap-distance-bottom:0;mso-position-horizontal:absolute;mso-position-horizontal-relative:text;mso-position-vertical:absolute;mso-position-vertical-relative:text;v-text-anchor:top" o:gfxdata="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" fillcolor="white [3201]" stroked="f" strokeweight=".5pt">
                 <v:textbox>
                   <w:txbxContent>
                     <w:p>
@@ -1114,7 +1117,7 @@
 </file>
 
 <file path=word/styles.xml><?xml version="1.0" encoding="utf-8"?>
-<w:styles xmlns:mc="http://schemas.openxmlformats.org/markup-compatibility/2006" xmlns:r="http://schemas.openxmlformats.org/officeDocument/2006/relationships" xmlns:w="http://schemas.openxmlformats.org/wordprocessingml/2006/main" xmlns:w14="http://schemas.microsoft.com/office/word/2010/wordml" xmlns:w15="http://schemas.microsoft.com/office/word/2012/wordml" mc:Ignorable="w14 w15">
+<w:styles xmlns:mc="http://schemas.openxmlformats.org/markup-compatibility/2006" xmlns:r="http://schemas.openxmlformats.org/officeDocument/2006/relationships" xmlns:w="http://schemas.openxmlformats.org/wordprocessingml/2006/main" xmlns:w14="http://schemas.microsoft.com/office/word/2010/wordml" xmlns:w15="http://schemas.microsoft.com/office/word/2012/wordml" xmlns:w16cex="http://schemas.microsoft.com/office/word/2018/wordml/cex" xmlns:w16cid="http://schemas.microsoft.com/office/word/2016/wordml/cid" xmlns:w16="http://schemas.microsoft.com/office/word/2018/wordml" xmlns:w16sdtdh="http://schemas.microsoft.com/office/word/2020/wordml/sdtdatahash" xmlns:w16se="http://schemas.microsoft.com/office/word/2015/wordml/symex" mc:Ignorable="w14 w15 w16se w16cid w16 w16cex w16sdtdh">
   <w:docDefaults>
     <w:rPrDefault>
       <w:rPr>
@@ -1130,7 +1133,7 @@
       </w:pPr>
     </w:pPrDefault>
   </w:docDefaults>
-  <w:latentStyles w:defLockedState="0" w:defUIPriority="99" w:defSemiHidden="0" w:defUnhideWhenUsed="0" w:defQFormat="0" w:count="371">
+  <w:latentStyles w:defLockedState="0" w:defUIPriority="99" w:defSemiHidden="0" w:defUnhideWhenUsed="0" w:defQFormat="0" w:count="376">
     <w:lsdException w:name="Normal" w:uiPriority="0" w:qFormat="1"/>
     <w:lsdException w:name="heading 1" w:uiPriority="9" w:qFormat="1"/>
     <w:lsdException w:name="heading 2" w:semiHidden="1" w:uiPriority="9" w:unhideWhenUsed="1" w:qFormat="1"/>
@@ -1236,7 +1239,6 @@
     <w:lsdException w:name="HTML Sample" w:semiHidden="1" w:unhideWhenUsed="1"/>
     <w:lsdException w:name="HTML Typewriter" w:semiHidden="1" w:unhideWhenUsed="1"/>
     <w:lsdException w:name="HTML Variable" w:semiHidden="1" w:unhideWhenUsed="1"/>
-    <w:lsdException w:name="Normal Table" w:semiHidden="1" w:unhideWhenUsed="1"/>
     <w:lsdException w:name="annotation subject" w:semiHidden="1" w:unhideWhenUsed="1"/>
     <w:lsdException w:name="No List" w:semiHidden="1" w:unhideWhenUsed="1"/>
     <w:lsdException w:name="Outline List 1" w:semiHidden="1" w:unhideWhenUsed="1"/>
@@ -1279,11 +1281,8 @@
     <w:lsdException w:name="Table Contemporary" w:semiHidden="1" w:unhideWhenUsed="1"/>
     <w:lsdException w:name="Table Elegant" w:semiHidden="1" w:unhideWhenUsed="1"/>
     <w:lsdException w:name="Table Professional" w:semiHidden="1" w:unhideWhenUsed="1"/>
-    <w:lsdException w:name="Table Subtle 1" w:semiHidden="1" w:unhideWhenUsed="1"/>
     <w:lsdException w:name="Table Subtle 2" w:semiHidden="1" w:unhideWhenUsed="1"/>
     <w:lsdException w:name="Table Web 1" w:semiHidden="1" w:unhideWhenUsed="1"/>
-    <w:lsdException w:name="Table Web 2" w:semiHidden="1" w:unhideWhenUsed="1"/>
-    <w:lsdException w:name="Table Web 3" w:semiHidden="1" w:unhideWhenUsed="1"/>
     <w:lsdException w:name="Balloon Text" w:semiHidden="1" w:unhideWhenUsed="1"/>
     <w:lsdException w:name="Table Grid" w:uiPriority="59"/>
     <w:lsdException w:name="Table Theme" w:semiHidden="1" w:unhideWhenUsed="1"/>
@@ -1502,6 +1501,11 @@
     <w:lsdException w:name="List Table 5 Dark Accent 6" w:uiPriority="50"/>
     <w:lsdException w:name="List Table 6 Colorful Accent 6" w:uiPriority="51"/>
     <w:lsdException w:name="List Table 7 Colorful Accent 6" w:uiPriority="52"/>
+    <w:lsdException w:name="Mention" w:semiHidden="1" w:unhideWhenUsed="1"/>
+    <w:lsdException w:name="Smart Hyperlink" w:semiHidden="1" w:unhideWhenUsed="1"/>
+    <w:lsdException w:name="Hashtag" w:semiHidden="1" w:unhideWhenUsed="1"/>
+    <w:lsdException w:name="Unresolved Mention" w:semiHidden="1" w:unhideWhenUsed="1"/>
+    <w:lsdException w:name="Smart Link" w:semiHidden="1" w:unhideWhenUsed="1"/>
   </w:latentStyles>
   <w:style w:type="paragraph" w:default="1" w:styleId="Normal">
     <w:name w:val="Normal"/>

</xml_diff>